<commit_message>
Recode taxonomy (d8), add abstract-level reporting indicators and effect-direction coding with 20% verification sample, update numbers to 113 trials / 116 reports / 288 assessed
Co-Authored-By: Claude Sonnet 5.5 <noreply@anthropic.com>
Claude-Session: https://claude.ai/code/session_01WHdoH2brsuf2zg1uU5YHyB
</commit_message>
<xml_diff>
--- a/paper/protocol_retrospective.docx
+++ b/paper/protocol_retrospective.docx
@@ -444,7 +444,7 @@
                 <w:sz w:val="19"/>
                 <w:szCs w:val="19"/>
               </w:rPr>
-              <w:t xml:space="preserve">Primary report of trial results. Protocols, registrations, reviews, commentaries, preprints superseded by a peer-reviewed report and secondary analyses without a randomized comparison of burnout are excluded.</w:t>
+              <w:t xml:space="preserve">Peer-reviewed primary report of trial results. Unpublished preprints without a peer-reviewed version, protocols, registrations, reviews, commentaries, preprints superseded by a peer-reviewed report and secondary analyses without a randomized comparison of burnout are excluded.</w:t>
             </w:r>
           </w:p>
         </w:tc>
@@ -582,7 +582,7 @@
                 <w:sz w:val="19"/>
                 <w:szCs w:val="19"/>
               </w:rPr>
-              <w:t xml:space="preserve">Workers: employed staff, practising professionals and trainees in paid employment such as resident physicians. Students, patients and general-public samples are excluded.</w:t>
+              <w:t xml:space="preserve">Workers: employed staff, practising professionals and trainees in paid employment such as resident physicians. Workers on sick leave who remain employed are included; students, patients and general-public samples are excluded.</w:t>
             </w:r>
           </w:p>
         </w:tc>
@@ -720,7 +720,7 @@
                 <w:sz w:val="19"/>
                 <w:szCs w:val="19"/>
               </w:rPr>
-              <w:t xml:space="preserve">Burnout measured with a burnout instrument or a named burnout subscale and reported as an outcome of the randomized comparison.</w:t>
+              <w:t xml:space="preserve">Burnout measured with a burnout instrument or a named burnout subscale and reported as an outcome of the randomized comparison. Trials in which burnout was measured but was unrelated to the aim of the intervention (for example a weight-loss programme), or was measured only with a general well-being index, are excluded.</w:t>
             </w:r>
           </w:p>
         </w:tc>
@@ -823,7 +823,7 @@
           <w:sz w:val="22"/>
           <w:szCs w:val="22"/>
         </w:rPr>
-        <w:t xml:space="preserve">One value per variable for each trial: occupational group; main delivery mode; intervention approach; mechanism; comparator; human support; burnout instrument (from the abstract or, if not named, from the full text); number of participants (randomized, or analysed where only that is reported); year of the first report. Multicomponent interventions were charted by the component presented as central. The charting data are in data/study_charting.csv.</w:t>
+        <w:t xml:space="preserve">One value per variable for each trial: occupational group; main delivery mode; intervention approach; mechanism; comparator; human support; burnout instrument (from the abstract or, if not named, from the full text); number of participants (randomized, or analysed where only that is reported); year of the first report. Multicomponent interventions were charted by the component presented as central. The charting data are in data/study_charting.csv. Two variables were coded from the abstract alone and are descriptive, not a quality or risk-of-bias assessment: five reporting indicators (named method of randomization, blinding statement, attrition numbers, trial registration number, stated analysis population; recorded as stated or not stated in the abstract, because an item missing from an abstract does not mean it was not done) and the direction of the burnout result as reported by the authors. Both were checked on a random sample of about 20% of the trials by the second reviewer (data/abstract_coding_verification_sample.csv).</w:t>
       </w:r>
     </w:p>
     <w:p>

</xml_diff>

<commit_message>
Respond to pre-submission review: unified update search, journal-format manuscript, supplement, title page, tracked changes, response
Adds the 18 Oct 2026 unified update search (two new trials), reinstates one trial after making the burnout criterion consistent with the stated scope (116 trials, 119 reports, 294 assessed), rebuilds the manuscript as a blinded main text under 3,000 words with AMA references, moves detail to a supplement with full search strings and full citations, and adds the point-by-point response.

Co-Authored-By: Claude Sonnet 5.5 <noreply@anthropic.com>
Claude-Session: https://claude.ai/code/session_01WHdoH2brsuf2zg1uU5YHyB
</commit_message>
<xml_diff>
--- a/paper/protocol_retrospective.docx
+++ b/paper/protocol_retrospective.docx
@@ -720,7 +720,7 @@
                 <w:sz w:val="19"/>
                 <w:szCs w:val="19"/>
               </w:rPr>
-              <w:t xml:space="preserve">Burnout measured with a burnout instrument or a named burnout subscale and reported as an outcome of the randomized comparison. Trials in which burnout was measured but was unrelated to the aim of the intervention (for example a weight-loss programme), or was measured only with a general well-being index, are excluded.</w:t>
+              <w:t xml:space="preserve">Burnout measured with a burnout instrument or a named burnout subscale and reported as an outcome of the randomized comparison. The aim of the intervention does not matter provided that burnout is reported as an outcome. Trials in which burnout served only as a correlate or risk factor, or was measured only with a general well-being index, are excluded; short and single-item measures presented by the authors as burnout measures are accepted. (Initially, one weight-reduction trial with burnout as a secondary outcome was excluded as unrelated to its aim; this was reversed because it contradicted the scope and the inclusion of other trials.)</w:t>
             </w:r>
           </w:p>
         </w:tc>
@@ -1357,6 +1357,144 @@
                 <w:szCs w:val="19"/>
               </w:rPr>
               <w:t xml:space="preserve">Two reports were changed after full texts were read: a trial that described itself as quasi-experimental but randomized teachers within schools was included, and a report that could not be retrieved initially was obtained, assessed and included. Three exclusions were confirmed.</w:t>
+            </w:r>
+          </w:p>
+        </w:tc>
+      </w:tr>
+      <w:tr>
+        <w:trPr>
+          <w:cantSplit/>
+        </w:trPr>
+        <w:tc>
+          <w:tcPr>
+            <w:tcW w:type="dxa" w:w="2808"/>
+            <w:tcBorders>
+              <w:top w:val="single" w:color="999999" w:sz="4"/>
+              <w:left w:val="single" w:color="999999" w:sz="4"/>
+              <w:bottom w:val="single" w:color="999999" w:sz="4"/>
+              <w:right w:val="single" w:color="999999" w:sz="4"/>
+            </w:tcBorders>
+            <w:tcMar>
+              <w:top w:type="dxa" w:w="60"/>
+              <w:left w:type="dxa" w:w="90"/>
+              <w:bottom w:type="dxa" w:w="60"/>
+              <w:right w:type="dxa" w:w="90"/>
+            </w:tcMar>
+          </w:tcPr>
+          <w:p>
+            <w:pPr>
+              <w:spacing w:after="0" w:line="260"/>
+            </w:pPr>
+            <w:r>
+              <w:rPr>
+                <w:rFonts w:ascii="Times New Roman" w:cs="Times New Roman" w:eastAsia="Times New Roman" w:hAnsi="Times New Roman"/>
+                <w:b w:val="false"/>
+                <w:bCs w:val="false"/>
+                <w:sz w:val="19"/>
+                <w:szCs w:val="19"/>
+              </w:rPr>
+              <w:t xml:space="preserve">Update search with a unified strategy</w:t>
+            </w:r>
+          </w:p>
+        </w:tc>
+        <w:tc>
+          <w:tcPr>
+            <w:tcW w:type="dxa" w:w="6552"/>
+            <w:tcBorders>
+              <w:top w:val="single" w:color="999999" w:sz="4"/>
+              <w:left w:val="single" w:color="999999" w:sz="4"/>
+              <w:bottom w:val="single" w:color="999999" w:sz="4"/>
+              <w:right w:val="single" w:color="999999" w:sz="4"/>
+            </w:tcBorders>
+            <w:tcMar>
+              <w:top w:type="dxa" w:w="60"/>
+              <w:left w:type="dxa" w:w="90"/>
+              <w:bottom w:type="dxa" w:w="60"/>
+              <w:right w:type="dxa" w:w="90"/>
+            </w:tcMar>
+          </w:tcPr>
+          <w:p>
+            <w:pPr>
+              <w:spacing w:after="0" w:line="260"/>
+            </w:pPr>
+            <w:r>
+              <w:rPr>
+                <w:rFonts w:ascii="Times New Roman" w:cs="Times New Roman" w:eastAsia="Times New Roman" w:hAnsi="Times New Roman"/>
+                <w:b w:val="false"/>
+                <w:bCs w:val="false"/>
+                <w:sz w:val="19"/>
+                <w:szCs w:val="19"/>
+              </w:rPr>
+              <w:t xml:space="preserve">After a review of the manuscript, a single search matching the eligibility criteria (burnout AND any digital-delivery term AND randomized design, no intervention block) was run on 18 Oct 2026 in Europe PMC (all years), OpenAlex and PubMed (records published from 1 Sep 2026). It found two further trials. It was not repeated in Web of Science, Scopus or ERIC.</w:t>
+            </w:r>
+          </w:p>
+        </w:tc>
+      </w:tr>
+      <w:tr>
+        <w:trPr>
+          <w:cantSplit/>
+        </w:trPr>
+        <w:tc>
+          <w:tcPr>
+            <w:tcW w:type="dxa" w:w="2808"/>
+            <w:tcBorders>
+              <w:top w:val="single" w:color="999999" w:sz="4"/>
+              <w:left w:val="single" w:color="999999" w:sz="4"/>
+              <w:bottom w:val="single" w:color="999999" w:sz="4"/>
+              <w:right w:val="single" w:color="999999" w:sz="4"/>
+            </w:tcBorders>
+            <w:tcMar>
+              <w:top w:type="dxa" w:w="60"/>
+              <w:left w:type="dxa" w:w="90"/>
+              <w:bottom w:type="dxa" w:w="60"/>
+              <w:right w:type="dxa" w:w="90"/>
+            </w:tcMar>
+          </w:tcPr>
+          <w:p>
+            <w:pPr>
+              <w:spacing w:after="0" w:line="260"/>
+            </w:pPr>
+            <w:r>
+              <w:rPr>
+                <w:rFonts w:ascii="Times New Roman" w:cs="Times New Roman" w:eastAsia="Times New Roman" w:hAnsi="Times New Roman"/>
+                <w:b w:val="false"/>
+                <w:bCs w:val="false"/>
+                <w:sz w:val="19"/>
+                <w:szCs w:val="19"/>
+              </w:rPr>
+              <w:t xml:space="preserve">Abstract-level coding</w:t>
+            </w:r>
+          </w:p>
+        </w:tc>
+        <w:tc>
+          <w:tcPr>
+            <w:tcW w:type="dxa" w:w="6552"/>
+            <w:tcBorders>
+              <w:top w:val="single" w:color="999999" w:sz="4"/>
+              <w:left w:val="single" w:color="999999" w:sz="4"/>
+              <w:bottom w:val="single" w:color="999999" w:sz="4"/>
+              <w:right w:val="single" w:color="999999" w:sz="4"/>
+            </w:tcBorders>
+            <w:tcMar>
+              <w:top w:type="dxa" w:w="60"/>
+              <w:left w:type="dxa" w:w="90"/>
+              <w:bottom w:type="dxa" w:w="60"/>
+              <w:right w:type="dxa" w:w="90"/>
+            </w:tcMar>
+          </w:tcPr>
+          <w:p>
+            <w:pPr>
+              <w:spacing w:after="0" w:line="260"/>
+            </w:pPr>
+            <w:r>
+              <w:rPr>
+                <w:rFonts w:ascii="Times New Roman" w:cs="Times New Roman" w:eastAsia="Times New Roman" w:hAnsi="Times New Roman"/>
+                <w:b w:val="false"/>
+                <w:bCs w:val="false"/>
+                <w:sz w:val="19"/>
+                <w:szCs w:val="19"/>
+              </w:rPr>
+              <w:t xml:space="preserve">Five reporting indicators and the direction of the burnout result were coded from abstracts only (not quality or risk of bias); a random 20% sample was coded independently by the second reviewer and the rules that the comparison exposed were applied to all trials.</w:t>
             </w:r>
           </w:p>
         </w:tc>

</xml_diff>